<commit_message>
Document why the Word results use 1,809 households, not 1,826
The 17-household gap is the dependency-ratio definition, not the
merge and not married/land/livestock. Those extra controls have no
missing values on the uploaded files.

Co-authored-by: nk11022 <nk11022@uga.edu>
</commit_message>
<xml_diff>
--- a/FIES_female_land_ownership_results.docx
+++ b/FIES_female_land_ownership_results.docx
@@ -135,7 +135,22 @@
           <w:i w:val="0"/>
           <w:sz w:val="22"/>
         </w:rPr>
-        <w:t>Three files are merged on household_id with keepusing() so post-planting names s2q05, s2q06 and s2q17 do not overwrite household education variables. The inner merge retains 1,969 households. Casewise deletion drops 38 missing SFI, 53 missing the dependency ratio, and 69 missing soil fertility. The estimation sample is 1,809 households in 200 enumeration areas, representing 13,063,904 people. Weight = pw_w5. This is the parcel-file subsample, not the full 4,829-household FIES file.</w:t>
+        <w:t>Three files are merged on household_id with keepusing() so post-planting names s2q05, s2q06 and s2q17 do not overwrite household education variables. The inner merge retains 1,969 households. Casewise deletion then drops 160 households: 38 missing SFI (all landless, total_land = 0), 53 missing the dependency ratio, and 84 missing soil fertility, with some overlap. The estimation sample is 1,809 households in 200 enumeration areas, representing 13,063,904 people. Weight = pw_w5. This is the parcel-file subsample, not the full 4,829-household FIES file.</w:t>
+      </w:r>
+    </w:p>
+    <w:p>
+      <w:pPr>
+        <w:spacing w:after="160" w:before="0" w:line="276" w:lineRule="auto"/>
+        <w:ind w:firstLine="432"/>
+      </w:pPr>
+      <w:r>
+        <w:rPr>
+          <w:rFonts w:ascii="Times New Roman" w:hAnsi="Times New Roman" w:eastAsia="Times New Roman"/>
+          <w:b w:val="0"/>
+          <w:i w:val="0"/>
+          <w:sz w:val="22"/>
+        </w:rPr>
+        <w:t>An earlier food-security table had N = 1,826, not 1,809. The 17-household gap is the dependency ratio, not the merge and not the extra controls on that table (married, total land, livestock). female landowner analysis.do built dependency_ratio = dependent / independent on the full household roster (child under 15, old over 64, working-age 15–64) and only then kept heads. food_security_ownership.do cannot do that: fies_household.dta is heads only, so it uses (household_size − active_hh_member) / active_hh_member and drops the household when active_hh_member is 0. Those 53 households are elderly-headed (head aged 65–90). 48 of them have SFI and soil fertility; 19 live alone and would also be missing under the roster formula; 29 have other members, and 17 of those 29 are the extra observations in the 1,826-row table — households with no economically active member but at least one person of working age on the roster. Distances, weights, and the extra old-table controls have no missing values on these files and do not change N. To recover 1,826, merge in the roster-built dependency_ratio from sect1.</w:t>
       </w:r>
     </w:p>
     <w:p>

</xml_diff>